<commit_message>
Fill operator identity in the accountants' partner .docx
The standalone handout still shipped with [obchodné meno], [adresa sídla],
[IČO] and [číslo SAK] placeholders. Fill with KILIAN LEGAL s. r. o.,
the seat, IČO 53 957 008 and SAK reg. č. 7185 (matching bonusy.json).

Co-Authored-By: Claude Opus 4.8 <noreply@anthropic.com>
</commit_message>
<xml_diff>
--- a/marketing/bod.legal_partnersky_material_uctovnici.docx
+++ b/marketing/bod.legal_partnersky_material_uctovnici.docx
@@ -59,7 +59,7 @@
         <w:rPr>
           <w:b w:val="0"/>
         </w:rPr>
-        <w:t>bod.legal je služba na kontrolu zmlúv pre slovenské firmy, ktorú poskytuje advokátska kancelária [obchodné meno advokátskej kancelárie], sídlo [adresa sídla], IČO [IČO], zapísaná v zozname Slovenskej advokátskej komory pod registračným číslom [číslo SAK]. Zmluvu o poskytovaní právnych služieb uzatvára klient vždy priamo s touto kanceláriou. Advokát s podporou umelej inteligencie pripraví rozbor rizík s odkazmi na konkrétne ustanovenia slovenských predpisov, každý výstup pred odovzdaním osobne skontroluje a za poskytnutú právnu službu zodpovedá. Klient dostane zrozumiteľný výstup s návrhmi úprav skôr, ako zmluvu podpíše. Služba je určená výlučne podnikateľom.</w:t>
+        <w:t>bod.legal je služba na kontrolu zmlúv pre slovenské firmy, ktorú poskytuje advokátska kancelária KILIAN LEGAL s. r. o., sídlo Hrudky 1401/46A, 900 25 Chorvátsky Grob, IČO 53 957 008, zapísaná v zozname Slovenskej advokátskej komory pod registračným číslom 7185. Zmluvu o poskytovaní právnych služieb uzatvára klient vždy priamo s touto kanceláriou. Advokát s podporou umelej inteligencie pripraví rozbor rizík s odkazmi na konkrétne ustanovenia slovenských predpisov, každý výstup pred odovzdaním osobne skontroluje a za poskytnutú právnu službu zodpovedá. Klient dostane zrozumiteľný výstup s návrhmi úprav skôr, ako zmluvu podpíše. Služba je určená výlučne podnikateľom.</w:t>
       </w:r>
     </w:p>
     <w:p>
@@ -235,7 +235,7 @@
         <w:rPr>
           <w:b w:val="0"/>
         </w:rPr>
-        <w:t>[obchodné meno advokátskej kancelárie]</w:t>
+        <w:t>KILIAN LEGAL s. r. o.</w:t>
       </w:r>
     </w:p>
     <w:p>
@@ -268,7 +268,7 @@
         <w:rPr>
           <w:b w:val="0"/>
         </w:rPr>
-        <w:t>Tento materiál je všeobecnou informáciou o službe a nie je právnou radou. Právne služby poskytuje [obchodné meno advokátskej kancelárie] na základe zmluvy s klientom a v rozsahu predložených podkladov.</w:t>
+        <w:t>Tento materiál je všeobecnou informáciou o službe a nie je právnou radou. Právne služby poskytuje KILIAN LEGAL s. r. o. na základe zmluvy s klientom a v rozsahu predložených podkladov.</w:t>
       </w:r>
     </w:p>
     <w:sectPr>

</xml_diff>